<commit_message>
fix(contrato-social-media): ajustes jurídicos — foro, bônus, datas comemorativas, gênero
- Cláusula 2.7: condicional comercial promocional explícita (R$1.5k → R$2k pós-período)
- Cláusula 8.1: total inicial de R$4.500 mencionado + remissão à 2.7 na renovação
- Cláusulas 4.29/4.30: proteção contra demanda ilimitada de datas comemorativas
- DÉCIMA PRIMEIRA: bônus consolidados (remove duplicação com antiga Cláusula 11)
- DÉCIMA SEGUNDA: cláusula de Eleição do Foro (Comarca Araruama/RJ) restaurada
- 4.13–4.17 removidas (conflito com 4.24/4.25 novas)
- CONTRATADO → CONTRATADA uniformizado
- Assinatura: apenas Roberto Lino Machado Neto
- DOCX regenerado

Co-Authored-By: Claude Sonnet 4.6 <noreply@anthropic.com>
</commit_message>
<xml_diff>
--- a/contract-templates/Contrato - Social Media.docx
+++ b/contract-templates/Contrato - Social Media.docx
@@ -228,7 +228,7 @@
         <w:jc w:val="both"/>
       </w:pPr>
       <w:r>
-        <w:t xml:space="preserve">{{clausula_reajuste}}</w:t>
+        <w:t xml:space="preserve">2.7. O valor mensal de R$ 1.500,00 (mil e quinhentos reais) corresponde a uma condição comercial promocional válida exclusivamente durante o período mínimo inicial de 3 (três) meses. Havendo renovação automática ou continuidade da prestação dos serviços após o período inicial, o valor mensal passará a ser de R$ 2.000,00 (dois mil reais), salvo novo acordo formal entre as partes.</w:t>
       </w:r>
     </w:p>
     <w:p>
@@ -648,82 +648,7 @@
         <w:jc w:val="both"/>
       </w:pPr>
       <w:r>
-        <w:t xml:space="preserve">4.13. A CONTRATADA poderá incluir, dentro do planejamento estratégico, conteúdos relacionados a </w:t>
-      </w:r>
-      <w:r>
-        <w:rPr>
-          <w:b/>
-          <w:bCs/>
-        </w:rPr>
-        <w:t xml:space="preserve">datas comemorativas, campanhas sazonais ou datas simbólicas</w:t>
-      </w:r>
-      <w:r>
-        <w:t xml:space="preserve">, com o objetivo de fortalecer o posicionamento da marca da CONTRATANTE;</w:t>
-      </w:r>
-    </w:p>
-    <w:p>
-      <w:pPr>
-        <w:spacing w:after="120" w:line="300"/>
-        <w:jc w:val="both"/>
-      </w:pPr>
-      <w:r>
-        <w:t xml:space="preserve">4.14. Os conteúdos de datas comemorativas possuem caráter </w:t>
-      </w:r>
-      <w:r>
-        <w:rPr>
-          <w:b/>
-          <w:bCs/>
-        </w:rPr>
-        <w:t xml:space="preserve">estratégico complementar</w:t>
-      </w:r>
-      <w:r>
-        <w:t xml:space="preserve">, não sendo considerados como conteúdo extra contratado, tampouco como obrigação fixa em todas as datas do calendário;</w:t>
-      </w:r>
-    </w:p>
-    <w:p>
-      <w:pPr>
-        <w:spacing w:after="120" w:line="300"/>
-        <w:jc w:val="both"/>
-      </w:pPr>
-      <w:r>
-        <w:t xml:space="preserve">4.15. Quando produzidos, os conteúdos de datas comemorativas </w:t>
-      </w:r>
-      <w:r>
-        <w:rPr>
-          <w:b/>
-          <w:bCs/>
-        </w:rPr>
-        <w:t xml:space="preserve">não serão contabilizados dentro do volume semanal contratado de postagens</w:t>
-      </w:r>
-      <w:r>
-        <w:t xml:space="preserve">, sendo tratados como entregas adicionais de valor estratégico;</w:t>
-      </w:r>
-    </w:p>
-    <w:p>
-      <w:pPr>
-        <w:spacing w:after="120" w:line="300"/>
-        <w:jc w:val="both"/>
-      </w:pPr>
-      <w:r>
-        <w:t xml:space="preserve">4.16. A definição das datas a serem trabalhadas será realizada com base na relevância estratégica para o negócio da CONTRATANTE, conforme planejamento mensal;</w:t>
-      </w:r>
-    </w:p>
-    <w:p>
-      <w:pPr>
-        <w:spacing w:after="120" w:line="300"/>
-        <w:jc w:val="both"/>
-      </w:pPr>
-      <w:r>
-        <w:t xml:space="preserve">4.17. A produção desses conteúdos dependerá do envio de informações, materiais e aprovações por parte da CONTRATANTE dentro dos prazos operacionais definidos;</w:t>
-      </w:r>
-    </w:p>
-    <w:p>
-      <w:pPr>
-        <w:spacing w:after="120" w:line="300"/>
-        <w:jc w:val="both"/>
-      </w:pPr>
-      <w:r>
-        <w:t xml:space="preserve">4.18. Toda solicitação de criação, alteração ou inclusão de conteúdos deverá ser realizada com </w:t>
+        <w:t xml:space="preserve">4.13. Toda solicitação de criação, alteração ou inclusão de conteúdos deverá ser realizada com </w:t>
       </w:r>
       <w:r>
         <w:rPr>
@@ -742,16 +667,16 @@
         <w:jc w:val="both"/>
       </w:pPr>
       <w:r>
-        <w:t xml:space="preserve">4.19. Solicitações realizadas fora desse prazo poderão não ser atendidas integralmente ou dentro do prazo desejado, não sendo caracterizada falha na prestação dos serviços por parte da CONTRATADA;</w:t>
-      </w:r>
-    </w:p>
-    <w:p>
-      <w:pPr>
-        <w:spacing w:after="120" w:line="300"/>
-        <w:jc w:val="both"/>
-      </w:pPr>
-      <w:r>
-        <w:t xml:space="preserve">4.20. Para conteúdos relacionados a datas comemorativas, campanhas sazonais ou ações específicas, a CONTRATANTE deverá fornecer materiais, informações e aprovações com antecedência mínima de </w:t>
+        <w:t xml:space="preserve">4.14. Solicitações realizadas fora desse prazo poderão não ser atendidas integralmente ou dentro do prazo desejado, não sendo caracterizada falha na prestação dos serviços por parte da CONTRATADA;</w:t>
+      </w:r>
+    </w:p>
+    <w:p>
+      <w:pPr>
+        <w:spacing w:after="120" w:line="300"/>
+        <w:jc w:val="both"/>
+      </w:pPr>
+      <w:r>
+        <w:t xml:space="preserve">4.15. Para conteúdos relacionados a datas comemorativas, campanhas sazonais ou ações específicas, a CONTRATANTE deverá fornecer materiais, informações e aprovações com antecedência mínima de </w:t>
       </w:r>
       <w:r>
         <w:rPr>
@@ -770,16 +695,16 @@
         <w:jc w:val="both"/>
       </w:pPr>
       <w:r>
-        <w:t xml:space="preserve">4.21. Demandas urgentes ou fora do prazo estabelecido estarão sujeitas à análise de viabilidade pela CONTRATADA, podendo ser recusadas ou reprogramadas conforme a disponibilidade operacional;</w:t>
-      </w:r>
-    </w:p>
-    <w:p>
-      <w:pPr>
-        <w:spacing w:after="120" w:line="300"/>
-        <w:jc w:val="both"/>
-      </w:pPr>
-      <w:r>
-        <w:t xml:space="preserve">4.22. A CONTRATADA é responsável exclusivamente pela </w:t>
+        <w:t xml:space="preserve">4.16. Demandas urgentes ou fora do prazo estabelecido estarão sujeitas à análise de viabilidade pela CONTRATADA, podendo ser recusadas ou reprogramadas conforme a disponibilidade operacional;</w:t>
+      </w:r>
+    </w:p>
+    <w:p>
+      <w:pPr>
+        <w:spacing w:after="120" w:line="300"/>
+        <w:jc w:val="both"/>
+      </w:pPr>
+      <w:r>
+        <w:t xml:space="preserve">4.17. A CONTRATADA é responsável exclusivamente pela </w:t>
       </w:r>
       <w:r>
         <w:rPr>
@@ -798,7 +723,7 @@
         <w:jc w:val="both"/>
       </w:pPr>
       <w:r>
-        <w:t xml:space="preserve">4.23. A CONTRATADA não realiza serviços de </w:t>
+        <w:t xml:space="preserve">4.18. A CONTRATADA não realiza serviços de </w:t>
       </w:r>
       <w:r>
         <w:rPr>
@@ -817,25 +742,25 @@
         <w:jc w:val="both"/>
       </w:pPr>
       <w:r>
-        <w:t xml:space="preserve">4.24. A CONTRATADA não garante resultados financeiros, uma vez que os resultados dependem de fatores externos à sua atuação, como atendimento, operação, produto e posicionamento da CONTRATANTE;</w:t>
-      </w:r>
-    </w:p>
-    <w:p>
-      <w:pPr>
-        <w:spacing w:after="120" w:line="300"/>
-        <w:jc w:val="both"/>
-      </w:pPr>
-      <w:r>
-        <w:t xml:space="preserve">4.25. A prestação dos serviços possui natureza estratégica e consultiva, não se limitando à execução operacional de postagens;</w:t>
-      </w:r>
-    </w:p>
-    <w:p>
-      <w:pPr>
-        <w:spacing w:after="120" w:line="300"/>
-        <w:jc w:val="both"/>
-      </w:pPr>
-      <w:r>
-        <w:t xml:space="preserve">4.26. Cada conteúdo poderá passar por até </w:t>
+        <w:t xml:space="preserve">4.19. A CONTRATADA não garante resultados financeiros, uma vez que os resultados dependem de fatores externos à sua atuação, como atendimento, operação, produto e posicionamento da CONTRATANTE;</w:t>
+      </w:r>
+    </w:p>
+    <w:p>
+      <w:pPr>
+        <w:spacing w:after="120" w:line="300"/>
+        <w:jc w:val="both"/>
+      </w:pPr>
+      <w:r>
+        <w:t xml:space="preserve">4.20. A prestação dos serviços possui natureza estratégica e consultiva, não se limitando à execução operacional de postagens;</w:t>
+      </w:r>
+    </w:p>
+    <w:p>
+      <w:pPr>
+        <w:spacing w:after="120" w:line="300"/>
+        <w:jc w:val="both"/>
+      </w:pPr>
+      <w:r>
+        <w:t xml:space="preserve">4.21. Cada conteúdo poderá passar por até </w:t>
       </w:r>
       <w:r>
         <w:rPr>
@@ -854,16 +779,34 @@
         <w:jc w:val="both"/>
       </w:pPr>
       <w:r>
-        <w:t xml:space="preserve">4.27. Solicitações adicionais de alteração poderão ser avaliadas e executadas mediante disponibilidade operacional ou negociação entre as partes.</w:t>
-      </w:r>
-    </w:p>
-    <w:p>
-      <w:pPr>
-        <w:spacing w:after="120" w:line="300"/>
-        <w:jc w:val="both"/>
-      </w:pPr>
-      <w:r>
-        <w:t xml:space="preserve">4.28. Os conteúdos serão produzidos e disponibilizados conforme o planejamento mensal, respeitando os prazos operacionais da CONTRATADA, que poderão variar de acordo com a demanda e complexidade das entregas.</w:t>
+        <w:t xml:space="preserve">4.22. Solicitações adicionais de alteração poderão ser avaliadas e executadas mediante disponibilidade operacional ou negociação entre as partes.</w:t>
+      </w:r>
+    </w:p>
+    <w:p>
+      <w:pPr>
+        <w:spacing w:after="120" w:line="300"/>
+        <w:jc w:val="both"/>
+      </w:pPr>
+      <w:r>
+        <w:t xml:space="preserve">4.23. Os conteúdos serão produzidos e disponibilizados conforme o planejamento mensal, respeitando os prazos operacionais da CONTRATADA, que poderão variar de acordo com a demanda e complexidade das entregas.</w:t>
+      </w:r>
+    </w:p>
+    <w:p>
+      <w:pPr>
+        <w:spacing w:after="120" w:line="300"/>
+        <w:jc w:val="both"/>
+      </w:pPr>
+      <w:r>
+        <w:t xml:space="preserve">4.24. A CONTRATADA poderá incluir, dentro do planejamento estratégico, conteúdos relacionados a datas comemorativas, campanhas sazonais ou datas simbólicas, desde que tais conteúdos sejam considerados relevantes para o negócio da CONTRATANTE e estejam dentro da viabilidade operacional e do volume mensal de produção previsto neste contrato.</w:t>
+      </w:r>
+    </w:p>
+    <w:p>
+      <w:pPr>
+        <w:spacing w:after="120" w:line="300"/>
+        <w:jc w:val="both"/>
+      </w:pPr>
+      <w:r>
+        <w:t xml:space="preserve">4.25. Conteúdos de datas comemorativas poderão ser tratados como ações estratégicas complementares, não caracterizando obrigação automática da CONTRATADA em produzir materiais para todas as datas do calendário. A execução dependerá do planejamento mensal, envio prévio de informações, materiais e aprovação da CONTRATANTE dentro dos prazos operacionais definidos.</w:t>
       </w:r>
     </w:p>
     <w:p>
@@ -890,25 +833,25 @@
         <w:jc w:val="both"/>
       </w:pPr>
       <w:r>
-        <w:t xml:space="preserve">5.1. O CONTRATADO deverá acessar, buscando a plena satisfação da prestação de serviço, objeto deste contrato, a conta do Business Manager, a página do Facebook e Instagram da CONTRATANTE e demais ferramentas e contas indispensáveis para a realização do serviço.</w:t>
-      </w:r>
-    </w:p>
-    <w:p>
-      <w:pPr>
-        <w:spacing w:after="120" w:line="300"/>
-        <w:jc w:val="both"/>
-      </w:pPr>
-      <w:r>
-        <w:t xml:space="preserve">5.2. Fica reservado ao CONTRATADO o acesso como administrador das plataformas: Business Manager, página do Facebook e Instagram da CONTRATANTE, entre outros, sem o qual a prestação dos serviços fica impossibilitada.</w:t>
-      </w:r>
-    </w:p>
-    <w:p>
-      <w:pPr>
-        <w:spacing w:after="120" w:line="300"/>
-        <w:jc w:val="both"/>
-      </w:pPr>
-      <w:r>
-        <w:t xml:space="preserve">5.3. O CONTRATADO não tem exclusividade com a CONTRATANTE, podendo assim, fechar outras parcerias com empresas do mesmo nicho ou nichos diferentes.</w:t>
+        <w:t xml:space="preserve">5.1. A CONTRATADA deverá acessar, buscando a plena satisfação da prestação de serviço, objeto deste contrato, a conta do Business Manager, a página do Facebook e Instagram da CONTRATANTE e demais ferramentas e contas indispensáveis para a realização do serviço.</w:t>
+      </w:r>
+    </w:p>
+    <w:p>
+      <w:pPr>
+        <w:spacing w:after="120" w:line="300"/>
+        <w:jc w:val="both"/>
+      </w:pPr>
+      <w:r>
+        <w:t xml:space="preserve">5.2. Fica reservado à CONTRATADA o acesso como administrador das plataformas: Business Manager, página do Facebook e Instagram da CONTRATANTE, entre outros, sem o qual a prestação dos serviços fica impossibilitada.</w:t>
+      </w:r>
+    </w:p>
+    <w:p>
+      <w:pPr>
+        <w:spacing w:after="120" w:line="300"/>
+        <w:jc w:val="both"/>
+      </w:pPr>
+      <w:r>
+        <w:t xml:space="preserve">5.3. A CONTRATADA não tem exclusividade com a CONTRATANTE, podendo assim, fechar outras parcerias com empresas do mesmo nicho ou nichos diferentes.</w:t>
       </w:r>
     </w:p>
     <w:p>
@@ -1054,16 +997,16 @@
         <w:jc w:val="both"/>
       </w:pPr>
       <w:r>
-        <w:t xml:space="preserve">7.1. Fornecer todas as informações que o CONTRATADO requisitar para o bom funcionamento e realização da prestação de serviços;</w:t>
-      </w:r>
-    </w:p>
-    <w:p>
-      <w:pPr>
-        <w:spacing w:after="120" w:line="300"/>
-        <w:jc w:val="both"/>
-      </w:pPr>
-      <w:r>
-        <w:t xml:space="preserve">7.2. Nomear um representante legal que possa estar acompanhando e estar frequentemente em contato com o CONTRATADO sempre que for necessário para o melhor funcionamento das estratégias e conteúdos desenvolvidos;</w:t>
+        <w:t xml:space="preserve">7.1. Fornecer todas as informações que a CONTRATADA requisitar para o bom funcionamento e realização da prestação de serviços;</w:t>
+      </w:r>
+    </w:p>
+    <w:p>
+      <w:pPr>
+        <w:spacing w:after="120" w:line="300"/>
+        <w:jc w:val="both"/>
+      </w:pPr>
+      <w:r>
+        <w:t xml:space="preserve">7.2. Nomear um representante legal que possa estar acompanhando e estar frequentemente em contato com a CONTRATADA sempre que for necessário para o melhor funcionamento das estratégias e conteúdos desenvolvidos;</w:t>
       </w:r>
     </w:p>
     <w:p>
@@ -1190,27 +1133,7 @@
         <w:jc w:val="both"/>
       </w:pPr>
       <w:r>
-        <w:t xml:space="preserve">8.1. O valor mensal do contrato será de </w:t>
-      </w:r>
-      <w:r>
-        <w:rPr>
-          <w:b/>
-          <w:bCs/>
-        </w:rPr>
-        <w:t xml:space="preserve">R$ {{valor_mensal_numero}} ({{valor_mensal_extenso}})</w:t>
-      </w:r>
-      <w:r>
-        <w:t xml:space="preserve">, a ser pago durante o período mínimo inicial de </w:t>
-      </w:r>
-      <w:r>
-        <w:rPr>
-          <w:b/>
-          <w:bCs/>
-        </w:rPr>
-        <w:t xml:space="preserve">{{duracao_meses_numero}} ({{duracao_meses_extenso}}) meses</w:t>
-      </w:r>
-      <w:r>
-        <w:t xml:space="preserve">, conforme as condições estabelecidas neste instrumento.</w:t>
+        <w:t xml:space="preserve">8.1. O valor mensal do contrato será de R$ 1.500,00 (mil e quinhentos reais), a ser pago durante o período mínimo inicial de 3 (três) meses, totalizando R$ 4.500,00 (quatro mil e quinhentos reais) durante a vigência contratual inicial. Após o período inicial, em caso de renovação ou continuidade da prestação dos serviços, aplicar-se-á o reajuste previsto na Cláusula 2.7 deste instrumento.</w:t>
       </w:r>
     </w:p>
     <w:p>
@@ -1606,92 +1529,34 @@
         <w:jc w:val="both"/>
       </w:pPr>
       <w:r>
-        <w:t xml:space="preserve">A CONTRATANTE poderá receber, a critério da CONTRATADA, serviços adicionais de caráter estratégico, sem custo extra, com o objetivo de potencializar os resultados da presença digital, sem que tais serviços integrem a obrigação principal deste contrato.</w:t>
-      </w:r>
-    </w:p>
-    <w:p>
-      <w:pPr>
-        <w:spacing w:after="120" w:line="300"/>
-        <w:jc w:val="both"/>
-      </w:pPr>
-      <w:r>
-        <w:t xml:space="preserve">11.1. </w:t>
-      </w:r>
-      <w:r>
-        <w:rPr>
-          <w:b/>
-          <w:bCs/>
-        </w:rPr>
-        <w:t xml:space="preserve">Consultoria de Posicionamento Digital:</w:t>
-      </w:r>
-      <w:r>
-        <w:t xml:space="preserve"> Análise estratégica do perfil da CONTRATANTE nas redes sociais, com recomendações práticas para melhoria de comunicação, autoridade e percepção de valor da marca.</w:t>
-      </w:r>
-    </w:p>
-    <w:p>
-      <w:pPr>
-        <w:spacing w:after="120" w:line="300"/>
-        <w:jc w:val="both"/>
-      </w:pPr>
-      <w:r>
-        <w:t xml:space="preserve">11.2. </w:t>
-      </w:r>
-      <w:r>
-        <w:rPr>
-          <w:b/>
-          <w:bCs/>
-        </w:rPr>
-        <w:t xml:space="preserve">Sugestões Estratégicas de Conteúdo:</w:t>
-      </w:r>
-      <w:r>
-        <w:t xml:space="preserve"> Indicação de ideias de conteúdos, tendências e formatos que possam aumentar o engajamento, retenção e conexão com o público.</w:t>
-      </w:r>
-    </w:p>
-    <w:p>
-      <w:pPr>
-        <w:spacing w:after="120" w:line="300"/>
-        <w:jc w:val="both"/>
-      </w:pPr>
-      <w:r>
-        <w:t xml:space="preserve">11.3. </w:t>
-      </w:r>
-      <w:r>
-        <w:rPr>
-          <w:b/>
-          <w:bCs/>
-        </w:rPr>
-        <w:t xml:space="preserve">Apoio na Estruturação do Perfil:</w:t>
-      </w:r>
-      <w:r>
-        <w:t xml:space="preserve"> Orientações sobre bio, destaques, organização visual do feed e estrutura geral do perfil, visando maior profissionalismo e conversão.</w:t>
-      </w:r>
-    </w:p>
-    <w:p>
-      <w:pPr>
-        <w:spacing w:after="120" w:line="300"/>
-        <w:jc w:val="both"/>
-      </w:pPr>
-      <w:r>
-        <w:t xml:space="preserve">11.4. </w:t>
-      </w:r>
-      <w:r>
-        <w:rPr>
-          <w:b/>
-          <w:bCs/>
-        </w:rPr>
-        <w:t xml:space="preserve">Direcionamento de Comunicação e Linguagem:</w:t>
-      </w:r>
-      <w:r>
-        <w:t xml:space="preserve"> Ajustes e recomendações sobre a forma de comunicação da marca, visando maior clareza, persuasão e alinhamento com o público-alvo.</w:t>
-      </w:r>
-    </w:p>
-    <w:p>
-      <w:pPr>
-        <w:spacing w:after="120" w:line="300"/>
-        <w:jc w:val="both"/>
-      </w:pPr>
-      <w:r>
-        <w:t xml:space="preserve">11.5. Os serviços descritos nesta cláusula possuem caráter complementar e poderão ser realizados conforme disponibilidade operacional da CONTRATADA, não sendo obrigatórios nem passíveis de cobrança futura caso não sejam executados.</w:t>
+        <w:t xml:space="preserve">O CONTRATANTE terá direito aos seguintes serviços adicionais, que serão prestados durante a vigência deste contrato como bônus estratégico, sem acréscimo ao valor mensal contratado, desde que respeitada a disponibilidade operacional da CONTRATADA e os limites previstos neste instrumento.</w:t>
+      </w:r>
+    </w:p>
+    <w:p>
+      <w:pPr>
+        <w:spacing w:after="120" w:line="300"/>
+        <w:jc w:val="both"/>
+      </w:pPr>
+      <w:r>
+        <w:t xml:space="preserve">11.1. Treinamento Comercial: A CONTRATANTE terá acesso a orientações estratégicas sobre atendimento e conversão de leads, incluindo análise de pontos de melhoria no atendimento e sugestões práticas para aumento da conversão comercial.</w:t>
+      </w:r>
+    </w:p>
+    <w:p>
+      <w:pPr>
+        <w:spacing w:after="120" w:line="300"/>
+        <w:jc w:val="both"/>
+      </w:pPr>
+      <w:r>
+        <w:t xml:space="preserve">11.2. Treinamento de Posicionamento: A CONTRATANTE poderá receber orientações estratégicas sobre posicionamento digital no Instagram, incluindo boas práticas de organização do perfil, comunicação visual, conteúdo e apresentação da marca.</w:t>
+      </w:r>
+    </w:p>
+    <w:p>
+      <w:pPr>
+        <w:spacing w:after="120" w:line="300"/>
+        <w:jc w:val="both"/>
+      </w:pPr>
+      <w:r>
+        <w:t xml:space="preserve">11.3. Os bônus previstos nesta cláusula possuem caráter acessório e estratégico, não constituindo obrigação operacional ilimitada, tampouco alterando o escopo principal contratado nas Cláusulas Primeira e Quarta deste instrumento.</w:t>
       </w:r>
     </w:p>
     <w:p>
@@ -1709,35 +1574,25 @@
         <w:jc w:val="center"/>
       </w:pPr>
       <w:r>
-        <w:t xml:space="preserve">CLÁUSULA DÉCIMA SEGUNDA - DA ELEIÇÃO DO FORO</w:t>
-      </w:r>
-    </w:p>
-    <w:p>
-      <w:pPr>
-        <w:spacing w:after="120" w:line="300"/>
-        <w:jc w:val="both"/>
-      </w:pPr>
-      <w:r>
-        <w:t xml:space="preserve">12.1. Fica eleito o foro da cidade de </w:t>
-      </w:r>
-      <w:r>
-        <w:rPr>
-          <w:b/>
-          <w:bCs/>
-        </w:rPr>
-        <w:t xml:space="preserve">Araruama/RJ</w:t>
-      </w:r>
-      <w:r>
-        <w:t xml:space="preserve">, para dirimir quaisquer controvérsias, dúvidas, desentendimentos, litígios resultantes do presente instrumento, estando ambas as partes renunciando a qualquer outro local, por mais privilegiado que o outro seja ou possa ser.</w:t>
-      </w:r>
-    </w:p>
-    <w:p>
-      <w:pPr>
-        <w:spacing w:after="120" w:line="300"/>
-        <w:jc w:val="both"/>
-      </w:pPr>
-      <w:r>
-        <w:t xml:space="preserve">O presente acordo é firmado entre as partes (CONTRATANTE E CONTRATADO).</w:t>
+        <w:t xml:space="preserve">CLÁUSULA DÉCIMA SEGUNDA – DA ELEIÇÃO DO FORO</w:t>
+      </w:r>
+    </w:p>
+    <w:p>
+      <w:pPr>
+        <w:spacing w:after="120" w:line="300"/>
+        <w:jc w:val="both"/>
+      </w:pPr>
+      <w:r>
+        <w:t xml:space="preserve">12.1. Para dirimir quaisquer controvérsias oriundas do presente instrumento, as partes elegem o Foro da Comarca de Araruama, Estado do Rio de Janeiro, com renúncia expressa a qualquer outro, por mais privilegiado que seja.</w:t>
+      </w:r>
+    </w:p>
+    <w:p>
+      <w:pPr>
+        <w:spacing w:after="120" w:line="300"/>
+        <w:jc w:val="both"/>
+      </w:pPr>
+      <w:r>
+        <w:t xml:space="preserve">O presente acordo é firmado entre as partes (CONTRATANTE E CONTRATADA).</w:t>
       </w:r>
     </w:p>
     <w:p>
@@ -1785,7 +1640,7 @@
         <w:jc w:val="both"/>
       </w:pPr>
       <w:r>
-        <w:t xml:space="preserve">Representado por {{lm_representante_nome}}</w:t>
+        <w:t xml:space="preserve">Representada por Roberto Lino Machado Neto</w:t>
       </w:r>
     </w:p>
     <w:p>

</xml_diff>